<commit_message>
main: gannt diagram, spaces in docs
</commit_message>
<xml_diff>
--- a/YaroslavKuchuk_TFM.docx
+++ b/YaroslavKuchuk_TFM.docx
@@ -344,13 +344,11 @@
         <w:jc w:val="center"/>
         <w:rPr>
           <w:rFonts w:ascii="Arial" w:hAnsi="Arial" w:cs="Arial"/>
-          <w:lang w:val="en-GB"/>
-        </w:rPr>
-      </w:pPr>
-      <w:r>
-        <w:rPr>
-          <w:rFonts w:ascii="Arial" w:hAnsi="Arial" w:cs="Arial"/>
-          <w:lang w:val="en-GB"/>
+        </w:rPr>
+      </w:pPr>
+      <w:r>
+        <w:rPr>
+          <w:rFonts w:ascii="Arial" w:hAnsi="Arial" w:cs="Arial"/>
         </w:rPr>
         <w:t>Yaroslav Kuchuk</w:t>
       </w:r>
@@ -361,13 +359,11 @@
         <w:jc w:val="center"/>
         <w:rPr>
           <w:rFonts w:ascii="Arial" w:hAnsi="Arial" w:cs="Arial"/>
-          <w:lang w:val="en-GB"/>
-        </w:rPr>
-      </w:pPr>
-      <w:r>
-        <w:rPr>
-          <w:rFonts w:ascii="Arial" w:hAnsi="Arial" w:cs="Arial"/>
-          <w:lang w:val="en-GB"/>
+        </w:rPr>
+      </w:pPr>
+      <w:r>
+        <w:rPr>
+          <w:rFonts w:ascii="Arial" w:hAnsi="Arial" w:cs="Arial"/>
         </w:rPr>
         <w:t>EAE Business School</w:t>
       </w:r>
@@ -2648,7 +2644,21 @@
         <w:rPr>
           <w:rFonts w:ascii="Arial" w:hAnsi="Arial" w:cs="Arial"/>
         </w:rPr>
-        <w:t>El presente Proyecto Final de Máster tiene como objetivo planificar la creación y puesta en funcionamiento de una agencia digital especializada en el desarrollo de software y la prestación de servicios tecnológicos para empresas. La organización tendrá su sede principal en Barcelona y ofrecerá inicialmente cinco líneas de servicio: desarrollo de software a medida, soluciones cloud, DevOps, integración de inteligencia artificial y mantenimiento y evolución de sistemas.</w:t>
+        <w:t xml:space="preserve">El presente Proyecto Final de Máster tiene como objetivo planificar la creación y puesta en funcionamiento de una agencia digital especializada en el desarrollo de software y la prestación de servicios tecnológicos para empresas. La organización tendrá su sede principal en Barcelona y ofrecerá inicialmente cinco líneas de servicio: desarrollo de software a medida, soluciones </w:t>
+      </w:r>
+      <w:proofErr w:type="spellStart"/>
+      <w:r>
+        <w:rPr>
+          <w:rFonts w:ascii="Arial" w:hAnsi="Arial" w:cs="Arial"/>
+        </w:rPr>
+        <w:t>cloud</w:t>
+      </w:r>
+      <w:proofErr w:type="spellEnd"/>
+      <w:r>
+        <w:rPr>
+          <w:rFonts w:ascii="Arial" w:hAnsi="Arial" w:cs="Arial"/>
+        </w:rPr>
+        <w:t>, DevOps, integración de inteligencia artificial y mantenimiento y evolución de sistemas.</w:t>
       </w:r>
     </w:p>
     <w:p>
@@ -2663,7 +2673,21 @@
         <w:rPr>
           <w:rFonts w:ascii="Arial" w:hAnsi="Arial" w:cs="Arial"/>
         </w:rPr>
-        <w:t>El proyecto parte de una decisión estratégica previamente adoptada por el patrocinador. Antes de su inicio se habrá analizado y aprobado el business case, autorizado la creación de la empresa e identificado tres clientes comprometidos a participar en proyectos piloto. En consecuencia, la validación de la oportunidad de negocio y la captación de nuevos clientes no forman parte del alcance del proyecto. El objetivo consiste en transformar esta decisión estratégica en una organización plenamente operativa y preparada para prestar los servicios definidos.</w:t>
+        <w:t xml:space="preserve">El proyecto parte de una decisión estratégica previamente adoptada por el patrocinador. Antes de su inicio se habrá analizado y aprobado el </w:t>
+      </w:r>
+      <w:proofErr w:type="spellStart"/>
+      <w:r>
+        <w:rPr>
+          <w:rFonts w:ascii="Arial" w:hAnsi="Arial" w:cs="Arial"/>
+        </w:rPr>
+        <w:t>business</w:t>
+      </w:r>
+      <w:proofErr w:type="spellEnd"/>
+      <w:r>
+        <w:rPr>
+          <w:rFonts w:ascii="Arial" w:hAnsi="Arial" w:cs="Arial"/>
+        </w:rPr>
+        <w:t xml:space="preserve"> case, autorizado la creación de la empresa e identificado tres clientes comprometidos a participar en proyectos piloto. En consecuencia, la validación de la oportunidad de negocio y la captación de nuevos clientes no forman parte del alcance del proyecto. El objetivo consiste en transformar esta decisión estratégica en una organización plenamente operativa y preparada para prestar los servicios definidos.</w:t>
       </w:r>
     </w:p>
     <w:p>
@@ -2693,7 +2717,21 @@
         <w:rPr>
           <w:rFonts w:ascii="Arial" w:hAnsi="Arial" w:cs="Arial"/>
         </w:rPr>
-        <w:t>La preparación operativa de la agencia será validada mediante la ejecución de exactamente tres proyectos piloto con los clientes previamente comprometidos. Estos proyectos permitirán comprobar de forma controlada el funcionamiento del modelo de delivery, los procesos internos y la plataforma tecnológica. Cada piloto dispondrá de criterios de aceptación previamente definidos y deberá ser formalmente aceptado por el cliente correspondiente. Los resultados obtenidos servirán para identificar e incorporar las mejoras necesarias antes de la transición definitiva a operaciones.</w:t>
+        <w:t xml:space="preserve">La preparación operativa de la agencia será validada mediante la ejecución de exactamente tres proyectos piloto con los clientes previamente comprometidos. Estos proyectos permitirán comprobar de forma controlada el funcionamiento del modelo de </w:t>
+      </w:r>
+      <w:proofErr w:type="spellStart"/>
+      <w:r>
+        <w:rPr>
+          <w:rFonts w:ascii="Arial" w:hAnsi="Arial" w:cs="Arial"/>
+        </w:rPr>
+        <w:t>delivery</w:t>
+      </w:r>
+      <w:proofErr w:type="spellEnd"/>
+      <w:r>
+        <w:rPr>
+          <w:rFonts w:ascii="Arial" w:hAnsi="Arial" w:cs="Arial"/>
+        </w:rPr>
+        <w:t>, los procesos internos y la plataforma tecnológica. Cada piloto dispondrá de criterios de aceptación previamente definidos y deberá ser formalmente aceptado por el cliente correspondiente. Los resultados obtenidos servirán para identificar e incorporar las mejoras necesarias antes de la transición definitiva a operaciones.</w:t>
       </w:r>
     </w:p>
     <w:p>
@@ -2807,7 +2845,21 @@
         <w:rPr>
           <w:rFonts w:ascii="Arial" w:hAnsi="Arial" w:cs="Arial"/>
         </w:rPr>
-        <w:t>El propósito del proyecto es crear y poner en funcionamiento una agencia digital especializada en el desarrollo de software y la prestación de servicios tecnológicos para empresas. La nueva organización ofrecerá inicialmente cinco líneas de servicio: desarrollo de software a medida, soluciones cloud, DevOps, integración de inteligencia artificial y mantenimiento y evolución de sistemas.</w:t>
+        <w:t xml:space="preserve">El propósito del proyecto es crear y poner en funcionamiento una agencia digital especializada en el desarrollo de software y la prestación de servicios tecnológicos para empresas. La nueva organización ofrecerá inicialmente cinco líneas de servicio: desarrollo de software a medida, soluciones </w:t>
+      </w:r>
+      <w:proofErr w:type="spellStart"/>
+      <w:r>
+        <w:rPr>
+          <w:rFonts w:ascii="Arial" w:hAnsi="Arial" w:cs="Arial"/>
+        </w:rPr>
+        <w:t>cloud</w:t>
+      </w:r>
+      <w:proofErr w:type="spellEnd"/>
+      <w:r>
+        <w:rPr>
+          <w:rFonts w:ascii="Arial" w:hAnsi="Arial" w:cs="Arial"/>
+        </w:rPr>
+        <w:t>, DevOps, integración de inteligencia artificial y mantenimiento y evolución de sistemas.</w:t>
       </w:r>
       <w:r>
         <w:rPr>
@@ -2828,7 +2880,21 @@
         <w:rPr>
           <w:rFonts w:ascii="Arial" w:hAnsi="Arial" w:cs="Arial"/>
         </w:rPr>
-        <w:t>El proyecto parte de una decisión estratégica adoptada previamente por el patrocinador. Antes de su inicio se habrá analizado y aprobado el business case, autorizado formalmente la creación de la empresa e identificado tres clientes comprometidos a participar en proyectos piloto. Por tanto, la evaluación de la oportunidad de negocio, la validación de la viabilidad comercial y la captación de nuevos clientes no forman parte del alcance del proyecto.</w:t>
+        <w:t xml:space="preserve">El proyecto parte de una decisión estratégica adoptada previamente por el patrocinador. Antes de su inicio se habrá analizado y aprobado el </w:t>
+      </w:r>
+      <w:proofErr w:type="spellStart"/>
+      <w:r>
+        <w:rPr>
+          <w:rFonts w:ascii="Arial" w:hAnsi="Arial" w:cs="Arial"/>
+        </w:rPr>
+        <w:t>business</w:t>
+      </w:r>
+      <w:proofErr w:type="spellEnd"/>
+      <w:r>
+        <w:rPr>
+          <w:rFonts w:ascii="Arial" w:hAnsi="Arial" w:cs="Arial"/>
+        </w:rPr>
+        <w:t xml:space="preserve"> case, autorizado formalmente la creación de la empresa e identificado tres clientes comprometidos a participar en proyectos piloto. Por tanto, la evaluación de la oportunidad de negocio, la validación de la viabilidad comercial y la captación de nuevos clientes no forman parte del alcance del proyecto.</w:t>
       </w:r>
     </w:p>
     <w:p>
@@ -2873,7 +2939,21 @@
         <w:rPr>
           <w:rFonts w:ascii="Arial" w:hAnsi="Arial" w:cs="Arial"/>
         </w:rPr>
-        <w:t>La justificación del proyecto responde a la decisión estratégica de crear una organización tecnológica competitiva, escalable y preparada para prestar servicios profesionales de desarrollo de software y transformación digital. Frente a modelos tradicionales de prestación de servicios tecnológicos, la agencia se diseñará desde su inicio utilizando procesos modernos de desarrollo, automatización DevOps, infraestructura cloud y herramientas de inteligencia artificial, con el objetivo de reducir los tiempos de entrega, mejorar la calidad del software y optimizar los costes operativos.</w:t>
+        <w:t xml:space="preserve">La justificación del proyecto responde a la decisión estratégica de crear una organización tecnológica competitiva, escalable y preparada para prestar servicios profesionales de desarrollo de software y transformación digital. Frente a modelos tradicionales de prestación de servicios tecnológicos, la agencia se diseñará desde su inicio utilizando procesos modernos de desarrollo, automatización DevOps, infraestructura </w:t>
+      </w:r>
+      <w:proofErr w:type="spellStart"/>
+      <w:r>
+        <w:rPr>
+          <w:rFonts w:ascii="Arial" w:hAnsi="Arial" w:cs="Arial"/>
+        </w:rPr>
+        <w:t>cloud</w:t>
+      </w:r>
+      <w:proofErr w:type="spellEnd"/>
+      <w:r>
+        <w:rPr>
+          <w:rFonts w:ascii="Arial" w:hAnsi="Arial" w:cs="Arial"/>
+        </w:rPr>
+        <w:t xml:space="preserve"> y herramientas de inteligencia artificial, con el objetivo de reducir los tiempos de entrega, mejorar la calidad del software y optimizar los costes operativos.</w:t>
       </w:r>
     </w:p>
     <w:p>
@@ -2947,7 +3027,21 @@
         <w:rPr>
           <w:rFonts w:ascii="Arial" w:hAnsi="Arial" w:cs="Arial"/>
         </w:rPr>
-        <w:t>La implantación será realizada por un equipo multidisciplinar compuesto por profesionales de dirección de proyectos, desarrollo de software, arquitectura de soluciones, DevOps y cloud, aseguramiento de calidad, UX/UI, recursos humanos, finanzas, marketing y administración. El modelo combinará recursos internos con la contratación puntual de proveedores y especialistas externos.</w:t>
+        <w:t xml:space="preserve">La implantación será realizada por un equipo multidisciplinar compuesto por profesionales de dirección de proyectos, desarrollo de software, arquitectura de soluciones, DevOps y </w:t>
+      </w:r>
+      <w:proofErr w:type="spellStart"/>
+      <w:r>
+        <w:rPr>
+          <w:rFonts w:ascii="Arial" w:hAnsi="Arial" w:cs="Arial"/>
+        </w:rPr>
+        <w:t>cloud</w:t>
+      </w:r>
+      <w:proofErr w:type="spellEnd"/>
+      <w:r>
+        <w:rPr>
+          <w:rFonts w:ascii="Arial" w:hAnsi="Arial" w:cs="Arial"/>
+        </w:rPr>
+        <w:t>, aseguramiento de calidad, UX/UI, recursos humanos, finanzas, marketing y administración. El modelo combinará recursos internos con la contratación puntual de proveedores y especialistas externos.</w:t>
       </w:r>
     </w:p>
     <w:p>
@@ -2992,7 +3086,21 @@
         <w:rPr>
           <w:rFonts w:ascii="Arial" w:hAnsi="Arial" w:cs="Arial"/>
         </w:rPr>
-        <w:t>La entrega principal será una agencia digital plenamente operativa y preparada para prestar servicios a clientes reales, con un equipo multidisciplinar constituido, una plataforma tecnológica y de desarrollo implantada, procesos de gestión y delivery definidos y un catálogo de servicios operativo.</w:t>
+        <w:t xml:space="preserve">La entrega principal será una agencia digital plenamente operativa y preparada para prestar servicios a clientes reales, con un equipo multidisciplinar constituido, una plataforma tecnológica y de desarrollo implantada, procesos de gestión y </w:t>
+      </w:r>
+      <w:proofErr w:type="spellStart"/>
+      <w:r>
+        <w:rPr>
+          <w:rFonts w:ascii="Arial" w:hAnsi="Arial" w:cs="Arial"/>
+        </w:rPr>
+        <w:t>delivery</w:t>
+      </w:r>
+      <w:proofErr w:type="spellEnd"/>
+      <w:r>
+        <w:rPr>
+          <w:rFonts w:ascii="Arial" w:hAnsi="Arial" w:cs="Arial"/>
+        </w:rPr>
+        <w:t xml:space="preserve"> definidos y un catálogo de servicios operativo.</w:t>
       </w:r>
     </w:p>
     <w:p>
@@ -3121,7 +3229,21 @@
         <w:rPr>
           <w:rFonts w:ascii="Arial" w:hAnsi="Arial" w:cs="Arial"/>
         </w:rPr>
-        <w:t>Se deberá implantar el catálogo inicial de servicios previamente aprobado, compuesto por desarrollo de software a medida, soluciones cloud, DevOps, integración de inteligencia artificial y mantenimiento y evolución de sistemas.</w:t>
+        <w:t xml:space="preserve">Se deberá implantar el catálogo inicial de servicios previamente aprobado, compuesto por desarrollo de software a medida, soluciones </w:t>
+      </w:r>
+      <w:proofErr w:type="spellStart"/>
+      <w:r>
+        <w:rPr>
+          <w:rFonts w:ascii="Arial" w:hAnsi="Arial" w:cs="Arial"/>
+        </w:rPr>
+        <w:t>cloud</w:t>
+      </w:r>
+      <w:proofErr w:type="spellEnd"/>
+      <w:r>
+        <w:rPr>
+          <w:rFonts w:ascii="Arial" w:hAnsi="Arial" w:cs="Arial"/>
+        </w:rPr>
+        <w:t>, DevOps, integración de inteligencia artificial y mantenimiento y evolución de sistemas.</w:t>
       </w:r>
     </w:p>
     <w:p>
@@ -3367,7 +3489,21 @@
         <w:rPr>
           <w:rFonts w:ascii="Arial" w:hAnsi="Arial" w:cs="Arial"/>
         </w:rPr>
-        <w:t>Catálogo de servicios y modelo de delivery implantados. Implantación de las cinco líneas de servicio y del modelo utilizado para estimar, planificar, ejecutar y entregar proyectos.</w:t>
+        <w:t xml:space="preserve">Catálogo de servicios y modelo de </w:t>
+      </w:r>
+      <w:proofErr w:type="spellStart"/>
+      <w:r>
+        <w:rPr>
+          <w:rFonts w:ascii="Arial" w:hAnsi="Arial" w:cs="Arial"/>
+        </w:rPr>
+        <w:t>delivery</w:t>
+      </w:r>
+      <w:proofErr w:type="spellEnd"/>
+      <w:r>
+        <w:rPr>
+          <w:rFonts w:ascii="Arial" w:hAnsi="Arial" w:cs="Arial"/>
+        </w:rPr>
+        <w:t xml:space="preserve"> implantados. Implantación de las cinco líneas de servicio y del modelo utilizado para estimar, planificar, ejecutar y entregar proyectos.</w:t>
       </w:r>
     </w:p>
     <w:p>
@@ -3386,7 +3522,35 @@
         <w:rPr>
           <w:rFonts w:ascii="Arial" w:hAnsi="Arial" w:cs="Arial"/>
         </w:rPr>
-        <w:t>Plataforma tecnológica e infraestructura de desarrollo implantadas. Infraestructura cloud, repositorios de código, CI/CD, herramientas de gestión, testing, documentación, monitorización y mecanismos de seguridad.</w:t>
+        <w:t xml:space="preserve">Plataforma tecnológica e infraestructura de desarrollo implantadas. Infraestructura </w:t>
+      </w:r>
+      <w:proofErr w:type="spellStart"/>
+      <w:r>
+        <w:rPr>
+          <w:rFonts w:ascii="Arial" w:hAnsi="Arial" w:cs="Arial"/>
+        </w:rPr>
+        <w:t>cloud</w:t>
+      </w:r>
+      <w:proofErr w:type="spellEnd"/>
+      <w:r>
+        <w:rPr>
+          <w:rFonts w:ascii="Arial" w:hAnsi="Arial" w:cs="Arial"/>
+        </w:rPr>
+        <w:t xml:space="preserve">, repositorios de código, CI/CD, herramientas de gestión, </w:t>
+      </w:r>
+      <w:proofErr w:type="spellStart"/>
+      <w:r>
+        <w:rPr>
+          <w:rFonts w:ascii="Arial" w:hAnsi="Arial" w:cs="Arial"/>
+        </w:rPr>
+        <w:t>testing</w:t>
+      </w:r>
+      <w:proofErr w:type="spellEnd"/>
+      <w:r>
+        <w:rPr>
+          <w:rFonts w:ascii="Arial" w:hAnsi="Arial" w:cs="Arial"/>
+        </w:rPr>
+        <w:t>, documentación, monitorización y mecanismos de seguridad.</w:t>
       </w:r>
     </w:p>
     <w:p>
@@ -3499,13 +3663,23 @@
         </w:rPr>
         <w:t xml:space="preserve">2.5 </w:t>
       </w:r>
+      <w:proofErr w:type="spellStart"/>
       <w:r>
         <w:rPr>
           <w:rFonts w:ascii="Arial" w:hAnsi="Arial" w:cs="Arial"/>
           <w:sz w:val="22"/>
           <w:szCs w:val="22"/>
         </w:rPr>
-        <w:t>Stakeholders principales</w:t>
+        <w:t>Stakeholders</w:t>
+      </w:r>
+      <w:proofErr w:type="spellEnd"/>
+      <w:r>
+        <w:rPr>
+          <w:rFonts w:ascii="Arial" w:hAnsi="Arial" w:cs="Arial"/>
+          <w:sz w:val="22"/>
+          <w:szCs w:val="22"/>
+        </w:rPr>
+        <w:t xml:space="preserve"> principales</w:t>
       </w:r>
       <w:bookmarkEnd w:id="7"/>
     </w:p>
@@ -3521,7 +3695,21 @@
         <w:rPr>
           <w:rFonts w:ascii="Arial" w:hAnsi="Arial" w:cs="Arial"/>
         </w:rPr>
-        <w:t>Los principales stakeholders identificados son:</w:t>
+        <w:t xml:space="preserve">Los principales </w:t>
+      </w:r>
+      <w:proofErr w:type="spellStart"/>
+      <w:r>
+        <w:rPr>
+          <w:rFonts w:ascii="Arial" w:hAnsi="Arial" w:cs="Arial"/>
+        </w:rPr>
+        <w:t>stakeholders</w:t>
+      </w:r>
+      <w:proofErr w:type="spellEnd"/>
+      <w:r>
+        <w:rPr>
+          <w:rFonts w:ascii="Arial" w:hAnsi="Arial" w:cs="Arial"/>
+        </w:rPr>
+        <w:t xml:space="preserve"> identificados son:</w:t>
       </w:r>
     </w:p>
     <w:p>
@@ -3540,7 +3728,35 @@
         <w:rPr>
           <w:rFonts w:ascii="Arial" w:hAnsi="Arial" w:cs="Arial"/>
         </w:rPr>
-        <w:t>Patrocinador del proyecto (Sponsor): Director General de la nueva agencia digital. Proporcionará dirección estratégica y apoyo ejecutivo, aprobará el presupuesto y los cambios principales, resolverá escalaciones y aceptará los principales entregables y el cierre del proyecto.</w:t>
+        <w:t>Patrocinador del proyecto (</w:t>
+      </w:r>
+      <w:proofErr w:type="gramStart"/>
+      <w:r>
+        <w:rPr>
+          <w:rFonts w:ascii="Arial" w:hAnsi="Arial" w:cs="Arial"/>
+        </w:rPr>
+        <w:t>Sponsor</w:t>
+      </w:r>
+      <w:proofErr w:type="gramEnd"/>
+      <w:r>
+        <w:rPr>
+          <w:rFonts w:ascii="Arial" w:hAnsi="Arial" w:cs="Arial"/>
+        </w:rPr>
+        <w:t xml:space="preserve">): </w:t>
+      </w:r>
+      <w:proofErr w:type="gramStart"/>
+      <w:r>
+        <w:rPr>
+          <w:rFonts w:ascii="Arial" w:hAnsi="Arial" w:cs="Arial"/>
+        </w:rPr>
+        <w:t>Director General</w:t>
+      </w:r>
+      <w:proofErr w:type="gramEnd"/>
+      <w:r>
+        <w:rPr>
+          <w:rFonts w:ascii="Arial" w:hAnsi="Arial" w:cs="Arial"/>
+        </w:rPr>
+        <w:t xml:space="preserve"> de la nueva agencia digital. Proporcionará dirección estratégica y apoyo ejecutivo, aprobará el presupuesto y los cambios principales, resolverá escalaciones y aceptará los principales entregables y el cierre del proyecto.</w:t>
       </w:r>
     </w:p>
     <w:p>
@@ -3584,7 +3800,21 @@
         <w:rPr>
           <w:rFonts w:ascii="Arial" w:hAnsi="Arial" w:cs="Arial"/>
         </w:rPr>
-        <w:t>equipo multidisciplinar formado por responsables y especialistas de tecnología y arquitectura, desarrollo, DevOps y cloud, QA, UX/UI, recursos humanos, finanzas y administración, legal y marketing.</w:t>
+        <w:t xml:space="preserve">equipo multidisciplinar formado por responsables y especialistas de tecnología y arquitectura, desarrollo, DevOps y </w:t>
+      </w:r>
+      <w:proofErr w:type="spellStart"/>
+      <w:r>
+        <w:rPr>
+          <w:rFonts w:ascii="Arial" w:hAnsi="Arial" w:cs="Arial"/>
+        </w:rPr>
+        <w:t>cloud</w:t>
+      </w:r>
+      <w:proofErr w:type="spellEnd"/>
+      <w:r>
+        <w:rPr>
+          <w:rFonts w:ascii="Arial" w:hAnsi="Arial" w:cs="Arial"/>
+        </w:rPr>
+        <w:t>, QA, UX/UI, recursos humanos, finanzas y administración, legal y marketing.</w:t>
       </w:r>
     </w:p>
     <w:p>
@@ -3628,13 +3858,35 @@
         <w:rPr>
           <w:rFonts w:ascii="Arial" w:hAnsi="Arial" w:cs="Arial"/>
         </w:rPr>
-        <w:t xml:space="preserve">Consejo de administración / grupo investor: </w:t>
-      </w:r>
-      <w:r>
-        <w:rPr>
-          <w:rFonts w:ascii="Arial" w:hAnsi="Arial" w:cs="Arial"/>
-        </w:rPr>
-        <w:t>stakeholders interesados en la creación de la empresa y en los resultados del proyecto.</w:t>
+        <w:t xml:space="preserve">Consejo de administración / grupo </w:t>
+      </w:r>
+      <w:proofErr w:type="spellStart"/>
+      <w:r>
+        <w:rPr>
+          <w:rFonts w:ascii="Arial" w:hAnsi="Arial" w:cs="Arial"/>
+        </w:rPr>
+        <w:t>investor</w:t>
+      </w:r>
+      <w:proofErr w:type="spellEnd"/>
+      <w:r>
+        <w:rPr>
+          <w:rFonts w:ascii="Arial" w:hAnsi="Arial" w:cs="Arial"/>
+        </w:rPr>
+        <w:t xml:space="preserve">: </w:t>
+      </w:r>
+      <w:proofErr w:type="spellStart"/>
+      <w:r>
+        <w:rPr>
+          <w:rFonts w:ascii="Arial" w:hAnsi="Arial" w:cs="Arial"/>
+        </w:rPr>
+        <w:t>stakeholders</w:t>
+      </w:r>
+      <w:proofErr w:type="spellEnd"/>
+      <w:r>
+        <w:rPr>
+          <w:rFonts w:ascii="Arial" w:hAnsi="Arial" w:cs="Arial"/>
+        </w:rPr>
+        <w:t xml:space="preserve"> interesados en la creación de la empresa y en los resultados del proyecto.</w:t>
       </w:r>
     </w:p>
     <w:p>
@@ -3659,7 +3911,21 @@
         <w:rPr>
           <w:rFonts w:ascii="Arial" w:hAnsi="Arial" w:cs="Arial"/>
         </w:rPr>
-        <w:t>proveedores cloud y software, servicios de selección de personal, asesoría legal y fiscal y otros especialistas necesarios.</w:t>
+        <w:t xml:space="preserve">proveedores </w:t>
+      </w:r>
+      <w:proofErr w:type="spellStart"/>
+      <w:r>
+        <w:rPr>
+          <w:rFonts w:ascii="Arial" w:hAnsi="Arial" w:cs="Arial"/>
+        </w:rPr>
+        <w:t>cloud</w:t>
+      </w:r>
+      <w:proofErr w:type="spellEnd"/>
+      <w:r>
+        <w:rPr>
+          <w:rFonts w:ascii="Arial" w:hAnsi="Arial" w:cs="Arial"/>
+        </w:rPr>
+        <w:t xml:space="preserve"> y software, servicios de selección de personal, asesoría legal y fiscal y otros especialistas necesarios.</w:t>
       </w:r>
     </w:p>
     <w:p>
@@ -3761,7 +4027,21 @@
         <w:rPr>
           <w:rFonts w:ascii="Arial" w:hAnsi="Arial" w:cs="Arial"/>
         </w:rPr>
-        <w:t>Alcance: implantar las cinco líneas de servicio previamente aprobadas: desarrollo de software, cloud, DevOps, inteligencia artificial y mantenimiento.</w:t>
+        <w:t xml:space="preserve">Alcance: implantar las cinco líneas de servicio previamente aprobadas: desarrollo de software, </w:t>
+      </w:r>
+      <w:proofErr w:type="spellStart"/>
+      <w:r>
+        <w:rPr>
+          <w:rFonts w:ascii="Arial" w:hAnsi="Arial" w:cs="Arial"/>
+        </w:rPr>
+        <w:t>cloud</w:t>
+      </w:r>
+      <w:proofErr w:type="spellEnd"/>
+      <w:r>
+        <w:rPr>
+          <w:rFonts w:ascii="Arial" w:hAnsi="Arial" w:cs="Arial"/>
+        </w:rPr>
+        <w:t>, DevOps, inteligencia artificial y mantenimiento.</w:t>
       </w:r>
     </w:p>
     <w:p>
@@ -4085,8 +4365,16 @@
               <w:rPr>
                 <w:rFonts w:ascii="Arial" w:hAnsi="Arial" w:cs="Arial"/>
               </w:rPr>
-              <w:t>Infraestructura tecnológica y servicios cloud</w:t>
-            </w:r>
+              <w:t xml:space="preserve">Infraestructura tecnológica y servicios </w:t>
+            </w:r>
+            <w:proofErr w:type="spellStart"/>
+            <w:r>
+              <w:rPr>
+                <w:rFonts w:ascii="Arial" w:hAnsi="Arial" w:cs="Arial"/>
+              </w:rPr>
+              <w:t>cloud</w:t>
+            </w:r>
+            <w:proofErr w:type="spellEnd"/>
           </w:p>
         </w:tc>
         <w:tc>
@@ -4762,7 +5050,21 @@
               <w:rPr>
                 <w:rFonts w:ascii="Arial" w:hAnsi="Arial" w:cs="Arial"/>
               </w:rPr>
-              <w:t>Modelo de delivery y procesos operativos aprobados</w:t>
+              <w:t xml:space="preserve">Modelo de </w:t>
+            </w:r>
+            <w:proofErr w:type="spellStart"/>
+            <w:r>
+              <w:rPr>
+                <w:rFonts w:ascii="Arial" w:hAnsi="Arial" w:cs="Arial"/>
+              </w:rPr>
+              <w:t>delivery</w:t>
+            </w:r>
+            <w:proofErr w:type="spellEnd"/>
+            <w:r>
+              <w:rPr>
+                <w:rFonts w:ascii="Arial" w:hAnsi="Arial" w:cs="Arial"/>
+              </w:rPr>
+              <w:t xml:space="preserve"> y procesos operativos aprobados</w:t>
             </w:r>
           </w:p>
         </w:tc>
@@ -5167,13 +5469,23 @@
         </w:rPr>
         <w:t xml:space="preserve">el </w:t>
       </w:r>
+      <w:proofErr w:type="spellStart"/>
       <w:r>
         <w:rPr>
           <w:rFonts w:ascii="Arial" w:hAnsi="Arial" w:cs="Arial"/>
           <w:i/>
           <w:iCs/>
         </w:rPr>
-        <w:t>business case</w:t>
+        <w:t>business</w:t>
+      </w:r>
+      <w:proofErr w:type="spellEnd"/>
+      <w:r>
+        <w:rPr>
+          <w:rFonts w:ascii="Arial" w:hAnsi="Arial" w:cs="Arial"/>
+          <w:i/>
+          <w:iCs/>
+        </w:rPr>
+        <w:t xml:space="preserve"> case</w:t>
       </w:r>
       <w:r>
         <w:rPr>
@@ -5247,7 +5559,21 @@
         <w:rPr>
           <w:rFonts w:ascii="Arial" w:hAnsi="Arial" w:cs="Arial"/>
         </w:rPr>
-        <w:t>las principales plataformas cloud y herramientas tecnológicas estarán disponibles en condiciones compatibles con la planificación;</w:t>
+        <w:t xml:space="preserve">las principales plataformas </w:t>
+      </w:r>
+      <w:proofErr w:type="spellStart"/>
+      <w:r>
+        <w:rPr>
+          <w:rFonts w:ascii="Arial" w:hAnsi="Arial" w:cs="Arial"/>
+        </w:rPr>
+        <w:t>cloud</w:t>
+      </w:r>
+      <w:proofErr w:type="spellEnd"/>
+      <w:r>
+        <w:rPr>
+          <w:rFonts w:ascii="Arial" w:hAnsi="Arial" w:cs="Arial"/>
+        </w:rPr>
+        <w:t xml:space="preserve"> y herramientas tecnológicas estarán disponibles en condiciones compatibles con la planificación;</w:t>
       </w:r>
     </w:p>
     <w:p>
@@ -5298,7 +5624,21 @@
         <w:rPr>
           <w:rFonts w:ascii="Arial" w:hAnsi="Arial" w:cs="Arial"/>
         </w:rPr>
-        <w:t>los clientes piloto proporcionarán oportunamente información, accesos, feedback y recursos;</w:t>
+        <w:t xml:space="preserve">los clientes piloto proporcionarán oportunamente información, accesos, </w:t>
+      </w:r>
+      <w:proofErr w:type="spellStart"/>
+      <w:r>
+        <w:rPr>
+          <w:rFonts w:ascii="Arial" w:hAnsi="Arial" w:cs="Arial"/>
+        </w:rPr>
+        <w:t>feedback</w:t>
+      </w:r>
+      <w:proofErr w:type="spellEnd"/>
+      <w:r>
+        <w:rPr>
+          <w:rFonts w:ascii="Arial" w:hAnsi="Arial" w:cs="Arial"/>
+        </w:rPr>
+        <w:t xml:space="preserve"> y recursos;</w:t>
       </w:r>
     </w:p>
     <w:p>
@@ -5896,7 +6236,21 @@
         <w:rPr>
           <w:rFonts w:ascii="Arial" w:hAnsi="Arial" w:cs="Arial"/>
         </w:rPr>
-        <w:t>La implantación de las cinco líneas de servicio previamente aprobadas: desarrollo de software a medida, soluciones cloud, DevOps, integración de inteligencia artificial y mantenimiento y evolución de sistemas.</w:t>
+        <w:t xml:space="preserve">La implantación de las cinco líneas de servicio previamente aprobadas: desarrollo de software a medida, soluciones </w:t>
+      </w:r>
+      <w:proofErr w:type="spellStart"/>
+      <w:r>
+        <w:rPr>
+          <w:rFonts w:ascii="Arial" w:hAnsi="Arial" w:cs="Arial"/>
+        </w:rPr>
+        <w:t>cloud</w:t>
+      </w:r>
+      <w:proofErr w:type="spellEnd"/>
+      <w:r>
+        <w:rPr>
+          <w:rFonts w:ascii="Arial" w:hAnsi="Arial" w:cs="Arial"/>
+        </w:rPr>
+        <w:t>, DevOps, integración de inteligencia artificial y mantenimiento y evolución de sistemas.</w:t>
       </w:r>
     </w:p>
     <w:p>
@@ -5915,7 +6269,21 @@
         <w:rPr>
           <w:rFonts w:ascii="Arial" w:hAnsi="Arial" w:cs="Arial"/>
         </w:rPr>
-        <w:t>El diseño e implantación del modelo de delivery utilizado para estimar, planificar, ejecutar, controlar y entregar los proyectos.</w:t>
+        <w:t xml:space="preserve">El diseño e implantación del modelo de </w:t>
+      </w:r>
+      <w:proofErr w:type="spellStart"/>
+      <w:r>
+        <w:rPr>
+          <w:rFonts w:ascii="Arial" w:hAnsi="Arial" w:cs="Arial"/>
+        </w:rPr>
+        <w:t>delivery</w:t>
+      </w:r>
+      <w:proofErr w:type="spellEnd"/>
+      <w:r>
+        <w:rPr>
+          <w:rFonts w:ascii="Arial" w:hAnsi="Arial" w:cs="Arial"/>
+        </w:rPr>
+        <w:t xml:space="preserve"> utilizado para estimar, planificar, ejecutar, controlar y entregar los proyectos.</w:t>
       </w:r>
     </w:p>
     <w:p>
@@ -5934,7 +6302,35 @@
         <w:rPr>
           <w:rFonts w:ascii="Arial" w:hAnsi="Arial" w:cs="Arial"/>
         </w:rPr>
-        <w:t>La implantación de la plataforma tecnológica necesaria para soportar el ciclo de desarrollo y entrega de software, incluyendo infraestructura cloud, repositorios de código, CI/CD, gestión de proyectos, testing, documentación, monitorización y mecanismos de seguridad.</w:t>
+        <w:t xml:space="preserve">La implantación de la plataforma tecnológica necesaria para soportar el ciclo de desarrollo y entrega de software, incluyendo infraestructura </w:t>
+      </w:r>
+      <w:proofErr w:type="spellStart"/>
+      <w:r>
+        <w:rPr>
+          <w:rFonts w:ascii="Arial" w:hAnsi="Arial" w:cs="Arial"/>
+        </w:rPr>
+        <w:t>cloud</w:t>
+      </w:r>
+      <w:proofErr w:type="spellEnd"/>
+      <w:r>
+        <w:rPr>
+          <w:rFonts w:ascii="Arial" w:hAnsi="Arial" w:cs="Arial"/>
+        </w:rPr>
+        <w:t xml:space="preserve">, repositorios de código, CI/CD, gestión de proyectos, </w:t>
+      </w:r>
+      <w:proofErr w:type="spellStart"/>
+      <w:r>
+        <w:rPr>
+          <w:rFonts w:ascii="Arial" w:hAnsi="Arial" w:cs="Arial"/>
+        </w:rPr>
+        <w:t>testing</w:t>
+      </w:r>
+      <w:proofErr w:type="spellEnd"/>
+      <w:r>
+        <w:rPr>
+          <w:rFonts w:ascii="Arial" w:hAnsi="Arial" w:cs="Arial"/>
+        </w:rPr>
+        <w:t>, documentación, monitorización y mecanismos de seguridad.</w:t>
       </w:r>
     </w:p>
     <w:p>
@@ -6101,7 +6497,21 @@
         <w:rPr>
           <w:rFonts w:ascii="Arial" w:hAnsi="Arial" w:cs="Arial"/>
         </w:rPr>
-        <w:t>La elaboración y aprobación del business case que justifica la creación de la agencia, ya que constituye una decisión previa al inicio del proyecto.</w:t>
+        <w:t xml:space="preserve">La elaboración y aprobación del </w:t>
+      </w:r>
+      <w:proofErr w:type="spellStart"/>
+      <w:r>
+        <w:rPr>
+          <w:rFonts w:ascii="Arial" w:hAnsi="Arial" w:cs="Arial"/>
+        </w:rPr>
+        <w:t>business</w:t>
+      </w:r>
+      <w:proofErr w:type="spellEnd"/>
+      <w:r>
+        <w:rPr>
+          <w:rFonts w:ascii="Arial" w:hAnsi="Arial" w:cs="Arial"/>
+        </w:rPr>
+        <w:t xml:space="preserve"> case que justifica la creación de la agencia, ya que constituye una decisión previa al inicio del proyecto.</w:t>
       </w:r>
     </w:p>
     <w:p>
@@ -6337,10 +6747,32 @@
     </w:p>
     <w:p>
       <w:pPr>
+        <w:rPr>
+          <w:rFonts w:ascii="Arial" w:hAnsi="Arial" w:cs="Arial"/>
+        </w:rPr>
+      </w:pPr>
+      <w:r>
+        <w:rPr>
+          <w:rFonts w:ascii="Arial" w:hAnsi="Arial" w:cs="Arial"/>
+        </w:rPr>
+        <w:br w:type="page"/>
+      </w:r>
+    </w:p>
+    <w:p>
+      <w:pPr>
         <w:ind w:firstLine="708"/>
         <w:jc w:val="both"/>
         <w:rPr>
           <w:rFonts w:ascii="Arial" w:hAnsi="Arial" w:cs="Arial"/>
+        </w:rPr>
+      </w:pPr>
+    </w:p>
+    <w:p>
+      <w:pPr>
+        <w:ind w:firstLine="708"/>
+        <w:jc w:val="both"/>
+        <w:rPr>
+          <w:rFonts w:ascii="Arial" w:hAnsi="Arial" w:cs="Arial"/>
           <w:b/>
           <w:bCs/>
         </w:rPr>
@@ -6367,15 +6799,7 @@
           <w:b/>
           <w:bCs/>
         </w:rPr>
-        <w:t xml:space="preserve"> </w:t>
-      </w:r>
-      <w:r>
-        <w:rPr>
-          <w:rFonts w:ascii="Arial" w:hAnsi="Arial" w:cs="Arial"/>
-          <w:b/>
-          <w:bCs/>
-        </w:rPr>
-        <w:t>Diccionario resumido de la Estructura de Desglose del Trabajo (EDT) (Elaboración propia).</w:t>
+        <w:t xml:space="preserve"> Diccionario resumido de la Estructura de Desglose del Trabajo (EDT) (Elaboración propia).</w:t>
       </w:r>
     </w:p>
     <w:tbl>
@@ -6701,7 +7125,21 @@
               <w:rPr>
                 <w:rFonts w:ascii="Arial" w:hAnsi="Arial" w:cs="Arial"/>
               </w:rPr>
-              <w:t>Modelo operativo y plan de implantación aprobados por el Sponsor.</w:t>
+              <w:t xml:space="preserve">Modelo operativo y plan de implantación aprobados por el </w:t>
+            </w:r>
+            <w:proofErr w:type="gramStart"/>
+            <w:r>
+              <w:rPr>
+                <w:rFonts w:ascii="Arial" w:hAnsi="Arial" w:cs="Arial"/>
+              </w:rPr>
+              <w:t>Sponsor</w:t>
+            </w:r>
+            <w:proofErr w:type="gramEnd"/>
+            <w:r>
+              <w:rPr>
+                <w:rFonts w:ascii="Arial" w:hAnsi="Arial" w:cs="Arial"/>
+              </w:rPr>
+              <w:t>.</w:t>
             </w:r>
           </w:p>
         </w:tc>
@@ -6774,11 +7212,19 @@
                 <w:rFonts w:ascii="Arial" w:hAnsi="Arial" w:cs="Arial"/>
               </w:rPr>
             </w:pPr>
-            <w:r>
-              <w:rPr>
-                <w:rFonts w:ascii="Arial" w:hAnsi="Arial" w:cs="Arial"/>
-              </w:rPr>
-              <w:t>Finance / Legal Lead</w:t>
+            <w:proofErr w:type="spellStart"/>
+            <w:r>
+              <w:rPr>
+                <w:rFonts w:ascii="Arial" w:hAnsi="Arial" w:cs="Arial"/>
+              </w:rPr>
+              <w:t>Finance</w:t>
+            </w:r>
+            <w:proofErr w:type="spellEnd"/>
+            <w:r>
+              <w:rPr>
+                <w:rFonts w:ascii="Arial" w:hAnsi="Arial" w:cs="Arial"/>
+              </w:rPr>
+              <w:t xml:space="preserve"> / Legal Lead</w:t>
             </w:r>
           </w:p>
         </w:tc>
@@ -6932,8 +7378,16 @@
               <w:rPr>
                 <w:rFonts w:ascii="Arial" w:hAnsi="Arial" w:cs="Arial"/>
               </w:rPr>
-              <w:t>Catálogo de servicios y modelo de delivery</w:t>
-            </w:r>
+              <w:t xml:space="preserve">Catálogo de servicios y modelo de </w:t>
+            </w:r>
+            <w:proofErr w:type="spellStart"/>
+            <w:r>
+              <w:rPr>
+                <w:rFonts w:ascii="Arial" w:hAnsi="Arial" w:cs="Arial"/>
+              </w:rPr>
+              <w:t>delivery</w:t>
+            </w:r>
+            <w:proofErr w:type="spellEnd"/>
           </w:p>
         </w:tc>
         <w:tc>
@@ -6965,11 +7419,19 @@
                 <w:rFonts w:ascii="Arial" w:hAnsi="Arial" w:cs="Arial"/>
               </w:rPr>
             </w:pPr>
-            <w:r>
-              <w:rPr>
-                <w:rFonts w:ascii="Arial" w:hAnsi="Arial" w:cs="Arial"/>
-              </w:rPr>
-              <w:t>Delivery Lead</w:t>
+            <w:proofErr w:type="spellStart"/>
+            <w:r>
+              <w:rPr>
+                <w:rFonts w:ascii="Arial" w:hAnsi="Arial" w:cs="Arial"/>
+              </w:rPr>
+              <w:t>Delivery</w:t>
+            </w:r>
+            <w:proofErr w:type="spellEnd"/>
+            <w:r>
+              <w:rPr>
+                <w:rFonts w:ascii="Arial" w:hAnsi="Arial" w:cs="Arial"/>
+              </w:rPr>
+              <w:t xml:space="preserve"> Lead</w:t>
             </w:r>
           </w:p>
         </w:tc>
@@ -6987,7 +7449,21 @@
               <w:rPr>
                 <w:rFonts w:ascii="Arial" w:hAnsi="Arial" w:cs="Arial"/>
               </w:rPr>
-              <w:t>Cinco líneas de servicio disponibles y modelo de delivery aprobado.</w:t>
+              <w:t xml:space="preserve">Cinco líneas de servicio disponibles y modelo de </w:t>
+            </w:r>
+            <w:proofErr w:type="spellStart"/>
+            <w:r>
+              <w:rPr>
+                <w:rFonts w:ascii="Arial" w:hAnsi="Arial" w:cs="Arial"/>
+              </w:rPr>
+              <w:t>delivery</w:t>
+            </w:r>
+            <w:proofErr w:type="spellEnd"/>
+            <w:r>
+              <w:rPr>
+                <w:rFonts w:ascii="Arial" w:hAnsi="Arial" w:cs="Arial"/>
+              </w:rPr>
+              <w:t xml:space="preserve"> aprobado.</w:t>
             </w:r>
           </w:p>
         </w:tc>
@@ -7046,7 +7522,35 @@
               <w:rPr>
                 <w:rFonts w:ascii="Arial" w:hAnsi="Arial" w:cs="Arial"/>
               </w:rPr>
-              <w:t>Implantación de infraestructura cloud, repositorios, CI/CD, herramientas de gestión, testing, documentación, monitorización y seguridad.</w:t>
+              <w:t xml:space="preserve">Implantación de infraestructura </w:t>
+            </w:r>
+            <w:proofErr w:type="spellStart"/>
+            <w:r>
+              <w:rPr>
+                <w:rFonts w:ascii="Arial" w:hAnsi="Arial" w:cs="Arial"/>
+              </w:rPr>
+              <w:t>cloud</w:t>
+            </w:r>
+            <w:proofErr w:type="spellEnd"/>
+            <w:r>
+              <w:rPr>
+                <w:rFonts w:ascii="Arial" w:hAnsi="Arial" w:cs="Arial"/>
+              </w:rPr>
+              <w:t xml:space="preserve">, repositorios, CI/CD, herramientas de gestión, </w:t>
+            </w:r>
+            <w:proofErr w:type="spellStart"/>
+            <w:r>
+              <w:rPr>
+                <w:rFonts w:ascii="Arial" w:hAnsi="Arial" w:cs="Arial"/>
+              </w:rPr>
+              <w:t>testing</w:t>
+            </w:r>
+            <w:proofErr w:type="spellEnd"/>
+            <w:r>
+              <w:rPr>
+                <w:rFonts w:ascii="Arial" w:hAnsi="Arial" w:cs="Arial"/>
+              </w:rPr>
+              <w:t>, documentación, monitorización y seguridad.</w:t>
             </w:r>
           </w:p>
         </w:tc>
@@ -7061,11 +7565,19 @@
                 <w:rFonts w:ascii="Arial" w:hAnsi="Arial" w:cs="Arial"/>
               </w:rPr>
             </w:pPr>
-            <w:r>
-              <w:rPr>
-                <w:rFonts w:ascii="Arial" w:hAnsi="Arial" w:cs="Arial"/>
-              </w:rPr>
-              <w:t>Technology Lead</w:t>
+            <w:proofErr w:type="spellStart"/>
+            <w:r>
+              <w:rPr>
+                <w:rFonts w:ascii="Arial" w:hAnsi="Arial" w:cs="Arial"/>
+              </w:rPr>
+              <w:t>Technology</w:t>
+            </w:r>
+            <w:proofErr w:type="spellEnd"/>
+            <w:r>
+              <w:rPr>
+                <w:rFonts w:ascii="Arial" w:hAnsi="Arial" w:cs="Arial"/>
+              </w:rPr>
+              <w:t xml:space="preserve"> Lead</w:t>
             </w:r>
           </w:p>
         </w:tc>
@@ -7160,7 +7672,21 @@
               <w:rPr>
                 <w:rFonts w:ascii="Arial" w:hAnsi="Arial" w:cs="Arial"/>
               </w:rPr>
-              <w:t>Project Manager / Quality Lead</w:t>
+              <w:t xml:space="preserve">Project Manager / </w:t>
+            </w:r>
+            <w:proofErr w:type="spellStart"/>
+            <w:r>
+              <w:rPr>
+                <w:rFonts w:ascii="Arial" w:hAnsi="Arial" w:cs="Arial"/>
+              </w:rPr>
+              <w:t>Quality</w:t>
+            </w:r>
+            <w:proofErr w:type="spellEnd"/>
+            <w:r>
+              <w:rPr>
+                <w:rFonts w:ascii="Arial" w:hAnsi="Arial" w:cs="Arial"/>
+              </w:rPr>
+              <w:t xml:space="preserve"> Lead</w:t>
             </w:r>
           </w:p>
         </w:tc>
@@ -7255,7 +7781,21 @@
               <w:rPr>
                 <w:rFonts w:ascii="Arial" w:hAnsi="Arial" w:cs="Arial"/>
               </w:rPr>
-              <w:t>Marketing / Commercial Lead</w:t>
+              <w:t xml:space="preserve">Marketing / </w:t>
+            </w:r>
+            <w:proofErr w:type="spellStart"/>
+            <w:r>
+              <w:rPr>
+                <w:rFonts w:ascii="Arial" w:hAnsi="Arial" w:cs="Arial"/>
+              </w:rPr>
+              <w:t>Commercial</w:t>
+            </w:r>
+            <w:proofErr w:type="spellEnd"/>
+            <w:r>
+              <w:rPr>
+                <w:rFonts w:ascii="Arial" w:hAnsi="Arial" w:cs="Arial"/>
+              </w:rPr>
+              <w:t xml:space="preserve"> Lead</w:t>
             </w:r>
           </w:p>
         </w:tc>
@@ -7347,11 +7887,19 @@
                 <w:rFonts w:ascii="Arial" w:hAnsi="Arial" w:cs="Arial"/>
               </w:rPr>
             </w:pPr>
-            <w:r>
-              <w:rPr>
-                <w:rFonts w:ascii="Arial" w:hAnsi="Arial" w:cs="Arial"/>
-              </w:rPr>
-              <w:t>Delivery Lead</w:t>
+            <w:proofErr w:type="spellStart"/>
+            <w:r>
+              <w:rPr>
+                <w:rFonts w:ascii="Arial" w:hAnsi="Arial" w:cs="Arial"/>
+              </w:rPr>
+              <w:t>Delivery</w:t>
+            </w:r>
+            <w:proofErr w:type="spellEnd"/>
+            <w:r>
+              <w:rPr>
+                <w:rFonts w:ascii="Arial" w:hAnsi="Arial" w:cs="Arial"/>
+              </w:rPr>
+              <w:t xml:space="preserve"> Lead</w:t>
             </w:r>
           </w:p>
         </w:tc>
@@ -7427,7 +7975,21 @@
               <w:rPr>
                 <w:rFonts w:ascii="Arial" w:hAnsi="Arial" w:cs="Arial"/>
               </w:rPr>
-              <w:t>Incorporación de mejoras, validación de readiness y transferencia de procesos, herramientas, conocimiento y responsabilidades.</w:t>
+              <w:t xml:space="preserve">Incorporación de mejoras, validación de </w:t>
+            </w:r>
+            <w:proofErr w:type="spellStart"/>
+            <w:r>
+              <w:rPr>
+                <w:rFonts w:ascii="Arial" w:hAnsi="Arial" w:cs="Arial"/>
+              </w:rPr>
+              <w:t>readiness</w:t>
+            </w:r>
+            <w:proofErr w:type="spellEnd"/>
+            <w:r>
+              <w:rPr>
+                <w:rFonts w:ascii="Arial" w:hAnsi="Arial" w:cs="Arial"/>
+              </w:rPr>
+              <w:t xml:space="preserve"> y transferencia de procesos, herramientas, conocimiento y responsabilidades.</w:t>
             </w:r>
           </w:p>
         </w:tc>
@@ -7446,8 +8008,16 @@
               <w:rPr>
                 <w:rFonts w:ascii="Arial" w:hAnsi="Arial" w:cs="Arial"/>
               </w:rPr>
-              <w:t>Project Manager / Sponsor</w:t>
-            </w:r>
+              <w:t xml:space="preserve">Project Manager / </w:t>
+            </w:r>
+            <w:proofErr w:type="gramStart"/>
+            <w:r>
+              <w:rPr>
+                <w:rFonts w:ascii="Arial" w:hAnsi="Arial" w:cs="Arial"/>
+              </w:rPr>
+              <w:t>Sponsor</w:t>
+            </w:r>
+            <w:proofErr w:type="gramEnd"/>
           </w:p>
         </w:tc>
         <w:tc>
@@ -7603,6 +8173,19 @@
     </w:p>
     <w:p>
       <w:pPr>
+        <w:rPr>
+          <w:rFonts w:ascii="Arial" w:hAnsi="Arial" w:cs="Arial"/>
+        </w:rPr>
+      </w:pPr>
+      <w:r>
+        <w:rPr>
+          <w:rFonts w:ascii="Arial" w:hAnsi="Arial" w:cs="Arial"/>
+        </w:rPr>
+        <w:br w:type="page"/>
+      </w:r>
+    </w:p>
+    <w:p>
+      <w:pPr>
         <w:ind w:firstLine="708"/>
         <w:jc w:val="both"/>
         <w:rPr>
@@ -7674,10 +8257,10 @@
           <w:noProof/>
         </w:rPr>
         <w:drawing>
-          <wp:inline distT="0" distB="0" distL="0" distR="0" wp14:anchorId="22483D23" wp14:editId="2627468D">
-            <wp:extent cx="9321548" cy="2115047"/>
-            <wp:effectExtent l="0" t="0" r="0" b="0"/>
-            <wp:docPr id="1857525621" name="Picture 2"/>
+          <wp:inline distT="0" distB="0" distL="0" distR="0" wp14:anchorId="5E372B9F" wp14:editId="68CCAB3A">
+            <wp:extent cx="5626524" cy="7657106"/>
+            <wp:effectExtent l="0" t="0" r="0" b="1270"/>
+            <wp:docPr id="280238234" name="Picture 1"/>
             <wp:cNvGraphicFramePr>
               <a:graphicFrameLocks xmlns:a="http://schemas.openxmlformats.org/drawingml/2006/main" noChangeAspect="1"/>
             </wp:cNvGraphicFramePr>
@@ -7685,7 +8268,7 @@
               <a:graphicData uri="http://schemas.openxmlformats.org/drawingml/2006/picture">
                 <pic:pic xmlns:pic="http://schemas.openxmlformats.org/drawingml/2006/picture">
                   <pic:nvPicPr>
-                    <pic:cNvPr id="0" name="Picture 3"/>
+                    <pic:cNvPr id="0" name="Picture 1"/>
                     <pic:cNvPicPr>
                       <a:picLocks noChangeAspect="1" noChangeArrowheads="1"/>
                     </pic:cNvPicPr>
@@ -7706,7 +8289,7 @@
                   <pic:spPr bwMode="auto">
                     <a:xfrm>
                       <a:off x="0" y="0"/>
-                      <a:ext cx="9336593" cy="2118461"/>
+                      <a:ext cx="5640744" cy="7676458"/>
                     </a:xfrm>
                     <a:prstGeom prst="rect">
                       <a:avLst/>
@@ -7744,7 +8327,21 @@
         <w:rPr>
           <w:rFonts w:ascii="Arial" w:hAnsi="Arial" w:cs="Arial"/>
         </w:rPr>
-        <w:t>La diagrama detallada se incluye en el Anexo 1.</w:t>
+        <w:t xml:space="preserve">La </w:t>
+      </w:r>
+      <w:proofErr w:type="gramStart"/>
+      <w:r>
+        <w:rPr>
+          <w:rFonts w:ascii="Arial" w:hAnsi="Arial" w:cs="Arial"/>
+        </w:rPr>
+        <w:t>diagrama detallada</w:t>
+      </w:r>
+      <w:proofErr w:type="gramEnd"/>
+      <w:r>
+        <w:rPr>
+          <w:rFonts w:ascii="Arial" w:hAnsi="Arial" w:cs="Arial"/>
+        </w:rPr>
+        <w:t xml:space="preserve"> se incluye en el Anexo 1.</w:t>
       </w:r>
     </w:p>
     <w:p>
@@ -8671,8 +9268,16 @@
               <w:rPr>
                 <w:rFonts w:ascii="Arial" w:hAnsi="Arial" w:cs="Arial"/>
               </w:rPr>
-              <w:t>Catálogo de servicios y modelo de delivery</w:t>
-            </w:r>
+              <w:t xml:space="preserve">Catálogo de servicios y modelo de </w:t>
+            </w:r>
+            <w:proofErr w:type="spellStart"/>
+            <w:r>
+              <w:rPr>
+                <w:rFonts w:ascii="Arial" w:hAnsi="Arial" w:cs="Arial"/>
+              </w:rPr>
+              <w:t>delivery</w:t>
+            </w:r>
+            <w:proofErr w:type="spellEnd"/>
           </w:p>
         </w:tc>
         <w:tc>
@@ -10673,7 +11278,21 @@
               <w:rPr>
                 <w:rFonts w:ascii="Arial" w:hAnsi="Arial" w:cs="Arial"/>
               </w:rPr>
-              <w:t>Modelo de delivery y procesos operativos aprobados</w:t>
+              <w:t xml:space="preserve">Modelo de </w:t>
+            </w:r>
+            <w:proofErr w:type="spellStart"/>
+            <w:r>
+              <w:rPr>
+                <w:rFonts w:ascii="Arial" w:hAnsi="Arial" w:cs="Arial"/>
+              </w:rPr>
+              <w:t>delivery</w:t>
+            </w:r>
+            <w:proofErr w:type="spellEnd"/>
+            <w:r>
+              <w:rPr>
+                <w:rFonts w:ascii="Arial" w:hAnsi="Arial" w:cs="Arial"/>
+              </w:rPr>
+              <w:t xml:space="preserve"> y procesos operativos aprobados</w:t>
             </w:r>
           </w:p>
         </w:tc>
@@ -10989,7 +11608,21 @@
         <w:rPr>
           <w:rFonts w:ascii="Arial" w:hAnsi="Arial" w:cs="Arial"/>
         </w:rPr>
-        <w:t>Una vez aprobado por el Sponsor y el Project Manager, el cronograma constituirá la línea base del cronograma del proyecto. Esta línea base será utilizada como referencia para evaluar el desempeño temporal durante la ejecución.</w:t>
+        <w:t xml:space="preserve">Una vez aprobado por el </w:t>
+      </w:r>
+      <w:proofErr w:type="gramStart"/>
+      <w:r>
+        <w:rPr>
+          <w:rFonts w:ascii="Arial" w:hAnsi="Arial" w:cs="Arial"/>
+        </w:rPr>
+        <w:t>Sponsor</w:t>
+      </w:r>
+      <w:proofErr w:type="gramEnd"/>
+      <w:r>
+        <w:rPr>
+          <w:rFonts w:ascii="Arial" w:hAnsi="Arial" w:cs="Arial"/>
+        </w:rPr>
+        <w:t xml:space="preserve"> y el Project Manager, el cronograma constituirá la línea base del cronograma del proyecto. Esta línea base será utilizada como referencia para evaluar el desempeño temporal durante la ejecución.</w:t>
       </w:r>
     </w:p>
     <w:p>

</xml_diff>